<commit_message>
docs(comercial): atualiza modelo de proposta comercial
</commit_message>
<xml_diff>
--- a/Modelos/definitivos/Comercial/modelos/Proposta Comercial.docx
+++ b/Modelos/definitivos/Comercial/modelos/Proposta Comercial.docx
@@ -802,6 +802,603 @@
         </w:rPr>
       </w:pPr>
     </w:p>
+    <w:tbl>
+      <w:tblPr>
+        <w:tblStyle w:val="Tabelacomgrade"/>
+        <w:tblW w:w="10700" w:type="dxa"/>
+        <w:tblBorders>
+          <w:left w:val="none" w:sz="0" w:space="0" w:color="auto"/>
+          <w:bottom w:val="none" w:sz="0" w:space="0" w:color="auto"/>
+          <w:right w:val="none" w:sz="0" w:space="0" w:color="auto"/>
+        </w:tblBorders>
+        <w:tblLook w:val="04A0" w:firstRow="1" w:lastRow="0" w:firstColumn="1" w:lastColumn="0" w:noHBand="0" w:noVBand="1"/>
+      </w:tblPr>
+      <w:tblGrid>
+        <w:gridCol w:w="5393"/>
+        <w:gridCol w:w="5307"/>
+      </w:tblGrid>
+      <w:tr>
+        <w:trPr>
+          <w:trHeight w:val="623"/>
+        </w:trPr>
+        <w:tc>
+          <w:tcPr>
+            <w:tcW w:w="5393" w:type="dxa"/>
+            <w:tcBorders>
+              <w:top w:val="single" w:sz="4" w:space="0" w:color="A6A6A6" w:themeColor="background1" w:themeShade="A6"/>
+              <w:bottom w:val="nil"/>
+              <w:right w:val="nil"/>
+            </w:tcBorders>
+          </w:tcPr>
+          <w:p>
+            <w:pPr>
+              <w:spacing w:after="0" w:line="276" w:lineRule="auto"/>
+              <w:rPr>
+                <w:rFonts w:ascii="Arial" w:hAnsi="Arial" w:cs="Arial"/>
+                <w:b/>
+                <w:sz w:val="4"/>
+                <w:szCs w:val="4"/>
+              </w:rPr>
+            </w:pPr>
+          </w:p>
+          <w:p>
+            <w:pPr>
+              <w:spacing w:after="0" w:line="276" w:lineRule="auto"/>
+              <w:rPr>
+                <w:rFonts w:ascii="Arial" w:hAnsi="Arial" w:cs="Arial"/>
+                <w:b/>
+                <w:sz w:val="24"/>
+                <w:szCs w:val="24"/>
+              </w:rPr>
+            </w:pPr>
+            <w:r>
+              <w:rPr>
+                <w:rFonts w:ascii="Arial" w:hAnsi="Arial" w:cs="Arial"/>
+                <w:b/>
+                <w:sz w:val="24"/>
+                <w:szCs w:val="24"/>
+              </w:rPr>
+              <w:t>DADOS INTERNOS</w:t>
+            </w:r>
+          </w:p>
+          <w:p>
+            <w:pPr>
+              <w:spacing w:after="0" w:line="276" w:lineRule="auto"/>
+              <w:rPr>
+                <w:rFonts w:ascii="Arial" w:hAnsi="Arial" w:cs="Arial"/>
+                <w:b/>
+                <w:sz w:val="10"/>
+                <w:szCs w:val="10"/>
+              </w:rPr>
+            </w:pPr>
+          </w:p>
+        </w:tc>
+        <w:tc>
+          <w:tcPr>
+            <w:tcW w:w="5307" w:type="dxa"/>
+            <w:tcBorders>
+              <w:top w:val="single" w:sz="4" w:space="0" w:color="A6A6A6" w:themeColor="background1" w:themeShade="A6"/>
+              <w:left w:val="nil"/>
+              <w:bottom w:val="nil"/>
+            </w:tcBorders>
+          </w:tcPr>
+          <w:p>
+            <w:pPr>
+              <w:spacing w:after="0" w:line="276" w:lineRule="auto"/>
+              <w:ind w:left="3102" w:hanging="3102"/>
+              <w:rPr>
+                <w:rFonts w:ascii="Arial" w:hAnsi="Arial" w:cs="Arial"/>
+                <w:b/>
+                <w:bCs/>
+                <w:sz w:val="4"/>
+                <w:szCs w:val="4"/>
+              </w:rPr>
+            </w:pPr>
+          </w:p>
+          <w:p>
+            <w:pPr>
+              <w:spacing w:after="0" w:line="276" w:lineRule="auto"/>
+              <w:ind w:left="3102" w:hanging="3102"/>
+              <w:rPr>
+                <w:rFonts w:ascii="Arial" w:hAnsi="Arial" w:cs="Arial"/>
+                <w:b/>
+                <w:bCs/>
+                <w:sz w:val="24"/>
+                <w:szCs w:val="24"/>
+              </w:rPr>
+            </w:pPr>
+            <w:r>
+              <w:rPr>
+                <w:rFonts w:ascii="Arial" w:hAnsi="Arial" w:cs="Arial"/>
+                <w:b/>
+                <w:bCs/>
+                <w:sz w:val="24"/>
+                <w:szCs w:val="24"/>
+              </w:rPr>
+              <w:t>DADOS DO CLIENTE</w:t>
+            </w:r>
+          </w:p>
+          <w:p>
+            <w:pPr>
+              <w:spacing w:after="0" w:line="276" w:lineRule="auto"/>
+              <w:ind w:left="3102" w:hanging="3102"/>
+              <w:rPr>
+                <w:rFonts w:ascii="Arial" w:hAnsi="Arial" w:cs="Arial"/>
+                <w:b/>
+                <w:bCs/>
+                <w:sz w:val="10"/>
+                <w:szCs w:val="10"/>
+              </w:rPr>
+            </w:pPr>
+          </w:p>
+        </w:tc>
+      </w:tr>
+      <w:tr>
+        <w:trPr>
+          <w:trHeight w:val="1026"/>
+        </w:trPr>
+        <w:tc>
+          <w:tcPr>
+            <w:tcW w:w="5393" w:type="dxa"/>
+            <w:tcBorders>
+              <w:top w:val="nil"/>
+              <w:right w:val="single" w:sz="4" w:space="0" w:color="A6A6A6" w:themeColor="background1" w:themeShade="A6"/>
+            </w:tcBorders>
+          </w:tcPr>
+          <w:p>
+            <w:pPr>
+              <w:spacing w:after="0" w:line="276" w:lineRule="auto"/>
+              <w:rPr>
+                <w:rFonts w:ascii="Arial" w:hAnsi="Arial" w:cs="Arial"/>
+                <w:bCs/>
+                <w:sz w:val="24"/>
+                <w:szCs w:val="24"/>
+              </w:rPr>
+            </w:pPr>
+            <w:r>
+              <w:rPr>
+                <w:rFonts w:ascii="Arial" w:hAnsi="Arial" w:cs="Arial"/>
+                <w:b/>
+                <w:sz w:val="24"/>
+                <w:szCs w:val="24"/>
+              </w:rPr>
+              <w:t>Consultor de Vendas:</w:t>
+            </w:r>
+            <w:r>
+              <w:rPr>
+                <w:rFonts w:ascii="Arial" w:hAnsi="Arial" w:cs="Arial"/>
+                <w:b/>
+                <w:bCs/>
+                <w:sz w:val="24"/>
+                <w:szCs w:val="24"/>
+              </w:rPr>
+              <w:t xml:space="preserve"> {{</w:t>
+            </w:r>
+            <w:proofErr w:type="spellStart"/>
+            <w:r>
+              <w:rPr>
+                <w:rFonts w:ascii="Arial" w:hAnsi="Arial" w:cs="Arial"/>
+                <w:b/>
+                <w:bCs/>
+                <w:sz w:val="24"/>
+                <w:szCs w:val="24"/>
+              </w:rPr>
+              <w:t>nome_vendedor</w:t>
+            </w:r>
+            <w:proofErr w:type="spellEnd"/>
+            <w:r>
+              <w:rPr>
+                <w:rFonts w:ascii="Arial" w:hAnsi="Arial" w:cs="Arial"/>
+                <w:b/>
+                <w:bCs/>
+                <w:sz w:val="24"/>
+                <w:szCs w:val="24"/>
+              </w:rPr>
+              <w:t>}}</w:t>
+            </w:r>
+          </w:p>
+          <w:p>
+            <w:pPr>
+              <w:spacing w:after="0" w:line="276" w:lineRule="auto"/>
+              <w:rPr>
+                <w:rFonts w:ascii="Arial" w:hAnsi="Arial" w:cs="Arial"/>
+                <w:b/>
+                <w:sz w:val="20"/>
+                <w:szCs w:val="20"/>
+              </w:rPr>
+            </w:pPr>
+            <w:r>
+              <w:rPr>
+                <w:rFonts w:ascii="Arial" w:hAnsi="Arial" w:cs="Arial"/>
+                <w:b/>
+                <w:sz w:val="24"/>
+                <w:szCs w:val="24"/>
+              </w:rPr>
+              <w:t>Orçamentista:</w:t>
+            </w:r>
+            <w:r>
+              <w:rPr>
+                <w:rFonts w:ascii="Arial" w:hAnsi="Arial" w:cs="Arial"/>
+                <w:bCs/>
+                <w:sz w:val="24"/>
+                <w:szCs w:val="24"/>
+              </w:rPr>
+              <w:t xml:space="preserve"> {{</w:t>
+            </w:r>
+            <w:proofErr w:type="spellStart"/>
+            <w:r>
+              <w:rPr>
+                <w:rFonts w:ascii="Arial" w:hAnsi="Arial" w:cs="Arial"/>
+                <w:bCs/>
+                <w:sz w:val="24"/>
+                <w:szCs w:val="24"/>
+              </w:rPr>
+              <w:t>elaborador_proposta</w:t>
+            </w:r>
+            <w:proofErr w:type="spellEnd"/>
+            <w:r>
+              <w:rPr>
+                <w:rFonts w:ascii="Arial" w:hAnsi="Arial" w:cs="Arial"/>
+                <w:bCs/>
+                <w:sz w:val="24"/>
+                <w:szCs w:val="24"/>
+              </w:rPr>
+              <w:t>}}</w:t>
+            </w:r>
+          </w:p>
+          <w:p>
+            <w:pPr>
+              <w:spacing w:after="0" w:line="276" w:lineRule="auto"/>
+              <w:rPr>
+                <w:rFonts w:ascii="Arial" w:hAnsi="Arial" w:cs="Arial"/>
+                <w:b/>
+                <w:sz w:val="24"/>
+                <w:szCs w:val="24"/>
+              </w:rPr>
+            </w:pPr>
+          </w:p>
+        </w:tc>
+        <w:tc>
+          <w:tcPr>
+            <w:tcW w:w="5307" w:type="dxa"/>
+            <w:tcBorders>
+              <w:top w:val="nil"/>
+              <w:left w:val="single" w:sz="4" w:space="0" w:color="A6A6A6" w:themeColor="background1" w:themeShade="A6"/>
+            </w:tcBorders>
+          </w:tcPr>
+          <w:p>
+            <w:pPr>
+              <w:spacing w:after="0" w:line="276" w:lineRule="auto"/>
+              <w:ind w:left="3102" w:hanging="3102"/>
+              <w:rPr>
+                <w:rFonts w:ascii="Arial" w:hAnsi="Arial" w:cs="Arial"/>
+                <w:b/>
+                <w:bCs/>
+                <w:sz w:val="24"/>
+                <w:szCs w:val="24"/>
+              </w:rPr>
+            </w:pPr>
+            <w:r>
+              <w:rPr>
+                <w:rFonts w:ascii="Arial" w:hAnsi="Arial" w:cs="Arial"/>
+                <w:b/>
+                <w:bCs/>
+                <w:sz w:val="24"/>
+                <w:szCs w:val="24"/>
+              </w:rPr>
+              <w:t>{{</w:t>
+            </w:r>
+            <w:proofErr w:type="spellStart"/>
+            <w:r>
+              <w:rPr>
+                <w:rFonts w:ascii="Arial" w:hAnsi="Arial" w:cs="Arial"/>
+                <w:b/>
+                <w:bCs/>
+                <w:sz w:val="24"/>
+                <w:szCs w:val="24"/>
+              </w:rPr>
+              <w:t>nome_cliente</w:t>
+            </w:r>
+            <w:proofErr w:type="spellEnd"/>
+            <w:r>
+              <w:rPr>
+                <w:rFonts w:ascii="Arial" w:hAnsi="Arial" w:cs="Arial"/>
+                <w:b/>
+                <w:bCs/>
+                <w:sz w:val="24"/>
+                <w:szCs w:val="24"/>
+              </w:rPr>
+              <w:t>}}</w:t>
+            </w:r>
+          </w:p>
+          <w:p>
+            <w:pPr>
+              <w:spacing w:after="0" w:line="276" w:lineRule="auto"/>
+              <w:ind w:left="3102" w:hanging="3102"/>
+              <w:rPr>
+                <w:rFonts w:ascii="Arial" w:hAnsi="Arial" w:cs="Arial"/>
+                <w:sz w:val="24"/>
+                <w:szCs w:val="24"/>
+              </w:rPr>
+            </w:pPr>
+            <w:r>
+              <w:rPr>
+                <w:rFonts w:ascii="Arial" w:hAnsi="Arial" w:cs="Arial"/>
+                <w:b/>
+                <w:bCs/>
+                <w:sz w:val="24"/>
+                <w:szCs w:val="24"/>
+              </w:rPr>
+              <w:t xml:space="preserve">A/C </w:t>
+            </w:r>
+            <w:r>
+              <w:rPr>
+                <w:rFonts w:ascii="Arial" w:hAnsi="Arial" w:cs="Arial"/>
+                <w:sz w:val="24"/>
+                <w:szCs w:val="24"/>
+              </w:rPr>
+              <w:t>{{</w:t>
+            </w:r>
+            <w:proofErr w:type="spellStart"/>
+            <w:r>
+              <w:rPr>
+                <w:rFonts w:ascii="Arial" w:hAnsi="Arial" w:cs="Arial"/>
+                <w:sz w:val="24"/>
+                <w:szCs w:val="24"/>
+              </w:rPr>
+              <w:t>contato_cliente</w:t>
+            </w:r>
+            <w:proofErr w:type="spellEnd"/>
+            <w:r>
+              <w:rPr>
+                <w:rFonts w:ascii="Arial" w:hAnsi="Arial" w:cs="Arial"/>
+                <w:sz w:val="24"/>
+                <w:szCs w:val="24"/>
+              </w:rPr>
+              <w:t>}}</w:t>
+            </w:r>
+          </w:p>
+          <w:p>
+            <w:pPr>
+              <w:spacing w:after="0" w:line="276" w:lineRule="auto"/>
+              <w:ind w:left="3102" w:hanging="3102"/>
+              <w:rPr>
+                <w:rFonts w:ascii="Arial" w:hAnsi="Arial" w:cs="Arial"/>
+                <w:sz w:val="24"/>
+                <w:szCs w:val="24"/>
+              </w:rPr>
+            </w:pPr>
+            <w:r>
+              <w:rPr>
+                <w:rFonts w:ascii="Arial" w:hAnsi="Arial" w:cs="Arial"/>
+                <w:b/>
+                <w:bCs/>
+                <w:sz w:val="24"/>
+                <w:szCs w:val="24"/>
+              </w:rPr>
+              <w:t>E-mail do solicitante:</w:t>
+            </w:r>
+            <w:r>
+              <w:rPr>
+                <w:rFonts w:ascii="Arial" w:hAnsi="Arial" w:cs="Arial"/>
+                <w:sz w:val="24"/>
+                <w:szCs w:val="24"/>
+              </w:rPr>
+              <w:t xml:space="preserve"> {{</w:t>
+            </w:r>
+            <w:proofErr w:type="spellStart"/>
+            <w:r>
+              <w:rPr>
+                <w:rFonts w:ascii="Arial" w:hAnsi="Arial" w:cs="Arial"/>
+                <w:sz w:val="24"/>
+                <w:szCs w:val="24"/>
+              </w:rPr>
+              <w:t>email_cliente</w:t>
+            </w:r>
+            <w:proofErr w:type="spellEnd"/>
+            <w:r>
+              <w:rPr>
+                <w:rFonts w:ascii="Arial" w:hAnsi="Arial" w:cs="Arial"/>
+                <w:sz w:val="24"/>
+                <w:szCs w:val="24"/>
+              </w:rPr>
+              <w:t>}}</w:t>
+            </w:r>
+          </w:p>
+          <w:p>
+            <w:pPr>
+              <w:spacing w:after="0" w:line="276" w:lineRule="auto"/>
+              <w:ind w:left="3102" w:hanging="3102"/>
+              <w:rPr>
+                <w:rFonts w:ascii="Arial" w:hAnsi="Arial" w:cs="Arial"/>
+                <w:sz w:val="24"/>
+                <w:szCs w:val="24"/>
+              </w:rPr>
+            </w:pPr>
+            <w:r>
+              <w:rPr>
+                <w:rFonts w:ascii="Arial" w:hAnsi="Arial" w:cs="Arial"/>
+                <w:b/>
+                <w:bCs/>
+                <w:sz w:val="24"/>
+                <w:szCs w:val="24"/>
+              </w:rPr>
+              <w:t>Departamento:</w:t>
+            </w:r>
+            <w:r>
+              <w:rPr>
+                <w:rFonts w:ascii="Arial" w:hAnsi="Arial" w:cs="Arial"/>
+                <w:sz w:val="24"/>
+                <w:szCs w:val="24"/>
+              </w:rPr>
+              <w:t xml:space="preserve"> {{</w:t>
+            </w:r>
+            <w:proofErr w:type="spellStart"/>
+            <w:r>
+              <w:rPr>
+                <w:rFonts w:ascii="Arial" w:hAnsi="Arial" w:cs="Arial"/>
+                <w:sz w:val="24"/>
+                <w:szCs w:val="24"/>
+              </w:rPr>
+              <w:t>dpto_solicitante</w:t>
+            </w:r>
+            <w:proofErr w:type="spellEnd"/>
+            <w:r>
+              <w:rPr>
+                <w:rFonts w:ascii="Arial" w:hAnsi="Arial" w:cs="Arial"/>
+                <w:sz w:val="24"/>
+                <w:szCs w:val="24"/>
+              </w:rPr>
+              <w:t>}}</w:t>
+            </w:r>
+          </w:p>
+          <w:p>
+            <w:pPr>
+              <w:tabs>
+                <w:tab w:val="left" w:pos="9945"/>
+              </w:tabs>
+              <w:spacing w:after="0" w:line="276" w:lineRule="auto"/>
+              <w:ind w:left="3102" w:hanging="3102"/>
+              <w:rPr>
+                <w:rFonts w:ascii="Arial" w:hAnsi="Arial" w:cs="Arial"/>
+                <w:sz w:val="24"/>
+                <w:szCs w:val="24"/>
+              </w:rPr>
+            </w:pPr>
+            <w:r>
+              <w:rPr>
+                <w:rFonts w:ascii="Arial" w:hAnsi="Arial" w:cs="Arial"/>
+                <w:sz w:val="24"/>
+                <w:szCs w:val="24"/>
+              </w:rPr>
+              <w:tab/>
+            </w:r>
+          </w:p>
+          <w:p>
+            <w:pPr>
+              <w:spacing w:after="0" w:line="276" w:lineRule="auto"/>
+              <w:ind w:left="3102" w:hanging="3102"/>
+              <w:rPr>
+                <w:rFonts w:ascii="Arial" w:hAnsi="Arial" w:cs="Arial"/>
+                <w:sz w:val="24"/>
+                <w:szCs w:val="24"/>
+              </w:rPr>
+            </w:pPr>
+            <w:r>
+              <w:rPr>
+                <w:rFonts w:ascii="Arial" w:hAnsi="Arial" w:cs="Arial"/>
+                <w:b/>
+                <w:bCs/>
+                <w:sz w:val="24"/>
+                <w:szCs w:val="24"/>
+              </w:rPr>
+              <w:t xml:space="preserve">Local da obra: </w:t>
+            </w:r>
+            <w:r>
+              <w:rPr>
+                <w:rFonts w:ascii="Arial" w:hAnsi="Arial" w:cs="Arial"/>
+                <w:sz w:val="24"/>
+                <w:szCs w:val="24"/>
+              </w:rPr>
+              <w:t>{{</w:t>
+            </w:r>
+            <w:proofErr w:type="spellStart"/>
+            <w:r>
+              <w:rPr>
+                <w:rFonts w:ascii="Arial" w:hAnsi="Arial" w:cs="Arial"/>
+                <w:sz w:val="24"/>
+                <w:szCs w:val="24"/>
+              </w:rPr>
+              <w:t>local_obra</w:t>
+            </w:r>
+            <w:proofErr w:type="spellEnd"/>
+            <w:r>
+              <w:rPr>
+                <w:rFonts w:ascii="Arial" w:hAnsi="Arial" w:cs="Arial"/>
+                <w:sz w:val="24"/>
+                <w:szCs w:val="24"/>
+              </w:rPr>
+              <w:t>}}</w:t>
+            </w:r>
+          </w:p>
+          <w:p>
+            <w:pPr>
+              <w:spacing w:after="0" w:line="276" w:lineRule="auto"/>
+              <w:ind w:left="3102" w:right="-55" w:hanging="3102"/>
+              <w:rPr>
+                <w:rFonts w:ascii="Arial" w:hAnsi="Arial" w:cs="Arial"/>
+                <w:b/>
+                <w:bCs/>
+                <w:sz w:val="24"/>
+                <w:szCs w:val="24"/>
+              </w:rPr>
+            </w:pPr>
+          </w:p>
+          <w:p>
+            <w:pPr>
+              <w:spacing w:after="0" w:line="276" w:lineRule="auto"/>
+              <w:ind w:left="3102" w:hanging="3102"/>
+              <w:rPr>
+                <w:rFonts w:ascii="Arial" w:hAnsi="Arial" w:cs="Arial"/>
+                <w:b/>
+                <w:bCs/>
+                <w:sz w:val="24"/>
+                <w:szCs w:val="24"/>
+              </w:rPr>
+            </w:pPr>
+            <w:r>
+              <w:rPr>
+                <w:rFonts w:ascii="Arial" w:hAnsi="Arial" w:cs="Arial"/>
+                <w:b/>
+                <w:bCs/>
+                <w:sz w:val="24"/>
+                <w:szCs w:val="24"/>
+              </w:rPr>
+              <w:t xml:space="preserve">CNPJ: </w:t>
+            </w:r>
+            <w:r>
+              <w:rPr>
+                <w:rFonts w:ascii="Arial" w:hAnsi="Arial" w:cs="Arial"/>
+                <w:sz w:val="24"/>
+                <w:szCs w:val="24"/>
+              </w:rPr>
+              <w:t>{{</w:t>
+            </w:r>
+            <w:proofErr w:type="spellStart"/>
+            <w:r>
+              <w:rPr>
+                <w:rFonts w:ascii="Arial" w:hAnsi="Arial" w:cs="Arial"/>
+                <w:sz w:val="24"/>
+                <w:szCs w:val="24"/>
+              </w:rPr>
+              <w:t>cnpj_texto</w:t>
+            </w:r>
+            <w:proofErr w:type="spellEnd"/>
+            <w:r>
+              <w:rPr>
+                <w:rFonts w:ascii="Arial" w:hAnsi="Arial" w:cs="Arial"/>
+                <w:sz w:val="24"/>
+                <w:szCs w:val="24"/>
+              </w:rPr>
+              <w:t>}}</w:t>
+            </w:r>
+          </w:p>
+          <w:p>
+            <w:pPr>
+              <w:spacing w:after="0" w:line="276" w:lineRule="auto"/>
+              <w:ind w:left="3102" w:hanging="3102"/>
+              <w:rPr>
+                <w:rFonts w:ascii="Arial" w:hAnsi="Arial" w:cs="Arial"/>
+                <w:b/>
+                <w:bCs/>
+                <w:sz w:val="24"/>
+                <w:szCs w:val="24"/>
+              </w:rPr>
+            </w:pPr>
+          </w:p>
+        </w:tc>
+      </w:tr>
+    </w:tbl>
     <w:p>
       <w:pPr>
         <w:spacing w:after="0" w:line="276" w:lineRule="auto"/>
@@ -821,527 +1418,7 @@
         </w:sectPr>
       </w:pPr>
     </w:p>
-    <w:p>
-      <w:pPr>
-        <w:spacing w:after="0" w:line="276" w:lineRule="auto"/>
-        <w:rPr>
-          <w:rFonts w:ascii="Arial" w:hAnsi="Arial" w:cs="Arial"/>
-          <w:b/>
-          <w:sz w:val="24"/>
-          <w:szCs w:val="24"/>
-        </w:rPr>
-      </w:pPr>
-      <w:r>
-        <w:rPr>
-          <w:rFonts w:ascii="Arial" w:hAnsi="Arial" w:cs="Arial"/>
-          <w:b/>
-          <w:sz w:val="24"/>
-          <w:szCs w:val="24"/>
-        </w:rPr>
-        <w:t>DADOS INTERNOS</w:t>
-      </w:r>
-    </w:p>
-    <w:p>
-      <w:pPr>
-        <w:spacing w:after="0" w:line="276" w:lineRule="auto"/>
-        <w:rPr>
-          <w:rFonts w:ascii="Arial" w:hAnsi="Arial" w:cs="Arial"/>
-          <w:bCs/>
-          <w:sz w:val="24"/>
-          <w:szCs w:val="24"/>
-        </w:rPr>
-      </w:pPr>
-      <w:r>
-        <w:rPr>
-          <w:rFonts w:ascii="Arial" w:hAnsi="Arial" w:cs="Arial"/>
-          <w:b/>
-          <w:sz w:val="24"/>
-          <w:szCs w:val="24"/>
-        </w:rPr>
-        <w:t>Consultor de Vendas:</w:t>
-      </w:r>
-      <w:r>
-        <w:rPr>
-          <w:rFonts w:ascii="Arial" w:hAnsi="Arial" w:cs="Arial"/>
-          <w:b/>
-          <w:bCs/>
-          <w:sz w:val="24"/>
-          <w:szCs w:val="24"/>
-        </w:rPr>
-        <w:t xml:space="preserve"> {{</w:t>
-      </w:r>
-      <w:proofErr w:type="spellStart"/>
-      <w:r>
-        <w:rPr>
-          <w:rFonts w:ascii="Arial" w:hAnsi="Arial" w:cs="Arial"/>
-          <w:b/>
-          <w:bCs/>
-          <w:sz w:val="24"/>
-          <w:szCs w:val="24"/>
-        </w:rPr>
-        <w:t>nome_vendedor</w:t>
-      </w:r>
-      <w:proofErr w:type="spellEnd"/>
-      <w:r>
-        <w:rPr>
-          <w:rFonts w:ascii="Arial" w:hAnsi="Arial" w:cs="Arial"/>
-          <w:b/>
-          <w:bCs/>
-          <w:sz w:val="24"/>
-          <w:szCs w:val="24"/>
-        </w:rPr>
-        <w:t>}}</w:t>
-      </w:r>
-    </w:p>
-    <w:p>
-      <w:pPr>
-        <w:spacing w:after="0" w:line="276" w:lineRule="auto"/>
-        <w:rPr>
-          <w:rFonts w:ascii="Arial" w:hAnsi="Arial" w:cs="Arial"/>
-          <w:b/>
-          <w:sz w:val="20"/>
-          <w:szCs w:val="20"/>
-        </w:rPr>
-      </w:pPr>
-      <w:r>
-        <w:rPr>
-          <w:rFonts w:ascii="Arial" w:hAnsi="Arial" w:cs="Arial"/>
-          <w:b/>
-          <w:sz w:val="24"/>
-          <w:szCs w:val="24"/>
-        </w:rPr>
-        <w:t>Orçamentista:</w:t>
-      </w:r>
-      <w:r>
-        <w:rPr>
-          <w:rFonts w:ascii="Arial" w:hAnsi="Arial" w:cs="Arial"/>
-          <w:bCs/>
-          <w:sz w:val="24"/>
-          <w:szCs w:val="24"/>
-        </w:rPr>
-        <w:t xml:space="preserve"> {{</w:t>
-      </w:r>
-      <w:proofErr w:type="spellStart"/>
-      <w:r>
-        <w:rPr>
-          <w:rFonts w:ascii="Arial" w:hAnsi="Arial" w:cs="Arial"/>
-          <w:bCs/>
-          <w:sz w:val="24"/>
-          <w:szCs w:val="24"/>
-        </w:rPr>
-        <w:t>elaborador_proposta</w:t>
-      </w:r>
-      <w:proofErr w:type="spellEnd"/>
-      <w:r>
-        <w:rPr>
-          <w:rFonts w:ascii="Arial" w:hAnsi="Arial" w:cs="Arial"/>
-          <w:bCs/>
-          <w:sz w:val="24"/>
-          <w:szCs w:val="24"/>
-        </w:rPr>
-        <w:t>}}</w:t>
-      </w:r>
-    </w:p>
-    <w:p>
-      <w:pPr>
-        <w:spacing w:after="0" w:line="276" w:lineRule="auto"/>
-        <w:rPr>
-          <w:rFonts w:ascii="Arial" w:hAnsi="Arial" w:cs="Arial"/>
-          <w:b/>
-          <w:sz w:val="20"/>
-          <w:szCs w:val="20"/>
-        </w:rPr>
-      </w:pPr>
-    </w:p>
-    <w:p>
-      <w:pPr>
-        <w:spacing w:after="0" w:line="276" w:lineRule="auto"/>
-        <w:rPr>
-          <w:rFonts w:ascii="Arial" w:hAnsi="Arial" w:cs="Arial"/>
-          <w:b/>
-          <w:sz w:val="20"/>
-          <w:szCs w:val="20"/>
-        </w:rPr>
-      </w:pPr>
-    </w:p>
-    <w:p>
-      <w:pPr>
-        <w:spacing w:after="0" w:line="276" w:lineRule="auto"/>
-        <w:rPr>
-          <w:rFonts w:ascii="Arial" w:hAnsi="Arial" w:cs="Arial"/>
-          <w:sz w:val="24"/>
-          <w:szCs w:val="24"/>
-        </w:rPr>
-      </w:pPr>
-    </w:p>
-    <w:p>
-      <w:pPr>
-        <w:spacing w:after="0" w:line="276" w:lineRule="auto"/>
-        <w:rPr>
-          <w:rFonts w:ascii="Arial" w:hAnsi="Arial" w:cs="Arial"/>
-          <w:b/>
-          <w:bCs/>
-          <w:sz w:val="24"/>
-          <w:szCs w:val="24"/>
-        </w:rPr>
-      </w:pPr>
-    </w:p>
-    <w:p>
-      <w:pPr>
-        <w:spacing w:after="0" w:line="276" w:lineRule="auto"/>
-        <w:rPr>
-          <w:rFonts w:ascii="Arial" w:hAnsi="Arial" w:cs="Arial"/>
-          <w:b/>
-          <w:bCs/>
-          <w:sz w:val="24"/>
-          <w:szCs w:val="24"/>
-        </w:rPr>
-      </w:pPr>
-    </w:p>
-    <w:p>
-      <w:pPr>
-        <w:spacing w:after="0" w:line="276" w:lineRule="auto"/>
-        <w:rPr>
-          <w:rFonts w:ascii="Arial" w:hAnsi="Arial" w:cs="Arial"/>
-          <w:b/>
-          <w:bCs/>
-          <w:sz w:val="24"/>
-          <w:szCs w:val="24"/>
-        </w:rPr>
-      </w:pPr>
-    </w:p>
-    <w:p>
-      <w:pPr>
-        <w:spacing w:after="0" w:line="276" w:lineRule="auto"/>
-        <w:rPr>
-          <w:rFonts w:ascii="Arial" w:hAnsi="Arial" w:cs="Arial"/>
-          <w:b/>
-          <w:bCs/>
-          <w:sz w:val="24"/>
-          <w:szCs w:val="24"/>
-        </w:rPr>
-      </w:pPr>
-      <w:r>
-        <w:rPr>
-          <w:rFonts w:ascii="Arial" w:hAnsi="Arial" w:cs="Arial"/>
-          <w:b/>
-          <w:bCs/>
-          <w:sz w:val="24"/>
-          <w:szCs w:val="24"/>
-        </w:rPr>
-        <w:t>DADOS DO CLIENTE</w:t>
-      </w:r>
-    </w:p>
-    <w:p>
-      <w:pPr>
-        <w:spacing w:after="0" w:line="276" w:lineRule="auto"/>
-        <w:rPr>
-          <w:rFonts w:ascii="Arial" w:hAnsi="Arial" w:cs="Arial"/>
-          <w:b/>
-          <w:bCs/>
-          <w:sz w:val="24"/>
-          <w:szCs w:val="24"/>
-        </w:rPr>
-      </w:pPr>
-      <w:r>
-        <w:rPr>
-          <w:rFonts w:ascii="Arial" w:hAnsi="Arial" w:cs="Arial"/>
-          <w:b/>
-          <w:bCs/>
-          <w:sz w:val="24"/>
-          <w:szCs w:val="24"/>
-        </w:rPr>
-        <w:t>{{</w:t>
-      </w:r>
-      <w:proofErr w:type="spellStart"/>
-      <w:r>
-        <w:rPr>
-          <w:rFonts w:ascii="Arial" w:hAnsi="Arial" w:cs="Arial"/>
-          <w:b/>
-          <w:bCs/>
-          <w:sz w:val="24"/>
-          <w:szCs w:val="24"/>
-        </w:rPr>
-        <w:t>nome_cliente</w:t>
-      </w:r>
-      <w:proofErr w:type="spellEnd"/>
-      <w:r>
-        <w:rPr>
-          <w:rFonts w:ascii="Arial" w:hAnsi="Arial" w:cs="Arial"/>
-          <w:b/>
-          <w:bCs/>
-          <w:sz w:val="24"/>
-          <w:szCs w:val="24"/>
-        </w:rPr>
-        <w:t>}}</w:t>
-      </w:r>
-    </w:p>
-    <w:p>
-      <w:pPr>
-        <w:spacing w:after="0" w:line="276" w:lineRule="auto"/>
-        <w:rPr>
-          <w:rFonts w:ascii="Arial" w:hAnsi="Arial" w:cs="Arial"/>
-          <w:sz w:val="24"/>
-          <w:szCs w:val="24"/>
-        </w:rPr>
-      </w:pPr>
-      <w:r>
-        <w:rPr>
-          <w:rFonts w:ascii="Arial" w:hAnsi="Arial" w:cs="Arial"/>
-          <w:b/>
-          <w:bCs/>
-          <w:sz w:val="24"/>
-          <w:szCs w:val="24"/>
-        </w:rPr>
-        <w:t xml:space="preserve">A/C </w:t>
-      </w:r>
-      <w:r>
-        <w:rPr>
-          <w:rFonts w:ascii="Arial" w:hAnsi="Arial" w:cs="Arial"/>
-          <w:sz w:val="24"/>
-          <w:szCs w:val="24"/>
-        </w:rPr>
-        <w:t>{{</w:t>
-      </w:r>
-      <w:proofErr w:type="spellStart"/>
-      <w:r>
-        <w:rPr>
-          <w:rFonts w:ascii="Arial" w:hAnsi="Arial" w:cs="Arial"/>
-          <w:sz w:val="24"/>
-          <w:szCs w:val="24"/>
-        </w:rPr>
-        <w:t>contato_cliente</w:t>
-      </w:r>
-      <w:proofErr w:type="spellEnd"/>
-      <w:r>
-        <w:rPr>
-          <w:rFonts w:ascii="Arial" w:hAnsi="Arial" w:cs="Arial"/>
-          <w:sz w:val="24"/>
-          <w:szCs w:val="24"/>
-        </w:rPr>
-        <w:t>}}</w:t>
-      </w:r>
-    </w:p>
-    <w:p>
-      <w:pPr>
-        <w:spacing w:after="0" w:line="276" w:lineRule="auto"/>
-        <w:rPr>
-          <w:rFonts w:ascii="Arial" w:hAnsi="Arial" w:cs="Arial"/>
-          <w:sz w:val="24"/>
-          <w:szCs w:val="24"/>
-        </w:rPr>
-      </w:pPr>
-      <w:r>
-        <w:rPr>
-          <w:rFonts w:ascii="Arial" w:hAnsi="Arial" w:cs="Arial"/>
-          <w:b/>
-          <w:bCs/>
-          <w:sz w:val="24"/>
-          <w:szCs w:val="24"/>
-        </w:rPr>
-        <w:t>E-mail do solicitante:</w:t>
-      </w:r>
-      <w:r>
-        <w:rPr>
-          <w:rFonts w:ascii="Arial" w:hAnsi="Arial" w:cs="Arial"/>
-          <w:sz w:val="24"/>
-          <w:szCs w:val="24"/>
-        </w:rPr>
-        <w:t xml:space="preserve"> {{</w:t>
-      </w:r>
-      <w:proofErr w:type="spellStart"/>
-      <w:r>
-        <w:rPr>
-          <w:rFonts w:ascii="Arial" w:hAnsi="Arial" w:cs="Arial"/>
-          <w:sz w:val="24"/>
-          <w:szCs w:val="24"/>
-        </w:rPr>
-        <w:t>email_cliente</w:t>
-      </w:r>
-      <w:proofErr w:type="spellEnd"/>
-      <w:r>
-        <w:rPr>
-          <w:rFonts w:ascii="Arial" w:hAnsi="Arial" w:cs="Arial"/>
-          <w:sz w:val="24"/>
-          <w:szCs w:val="24"/>
-        </w:rPr>
-        <w:t>}}</w:t>
-      </w:r>
-    </w:p>
-    <w:p>
-      <w:pPr>
-        <w:spacing w:after="0" w:line="276" w:lineRule="auto"/>
-        <w:rPr>
-          <w:rFonts w:ascii="Arial" w:hAnsi="Arial" w:cs="Arial"/>
-          <w:sz w:val="24"/>
-          <w:szCs w:val="24"/>
-        </w:rPr>
-      </w:pPr>
-      <w:r>
-        <w:rPr>
-          <w:rFonts w:ascii="Arial" w:hAnsi="Arial" w:cs="Arial"/>
-          <w:b/>
-          <w:bCs/>
-          <w:sz w:val="24"/>
-          <w:szCs w:val="24"/>
-        </w:rPr>
-        <w:t>Departamento:</w:t>
-      </w:r>
-      <w:r>
-        <w:rPr>
-          <w:rFonts w:ascii="Arial" w:hAnsi="Arial" w:cs="Arial"/>
-          <w:sz w:val="24"/>
-          <w:szCs w:val="24"/>
-        </w:rPr>
-        <w:t xml:space="preserve"> {{</w:t>
-      </w:r>
-      <w:proofErr w:type="spellStart"/>
-      <w:r>
-        <w:rPr>
-          <w:rFonts w:ascii="Arial" w:hAnsi="Arial" w:cs="Arial"/>
-          <w:sz w:val="24"/>
-          <w:szCs w:val="24"/>
-        </w:rPr>
-        <w:t>dpto_solicitante</w:t>
-      </w:r>
-      <w:proofErr w:type="spellEnd"/>
-      <w:r>
-        <w:rPr>
-          <w:rFonts w:ascii="Arial" w:hAnsi="Arial" w:cs="Arial"/>
-          <w:sz w:val="24"/>
-          <w:szCs w:val="24"/>
-        </w:rPr>
-        <w:t>}}</w:t>
-      </w:r>
-    </w:p>
-    <w:p>
-      <w:pPr>
-        <w:tabs>
-          <w:tab w:val="left" w:pos="9945"/>
-        </w:tabs>
-        <w:spacing w:after="0" w:line="276" w:lineRule="auto"/>
-        <w:rPr>
-          <w:rFonts w:ascii="Arial" w:hAnsi="Arial" w:cs="Arial"/>
-          <w:sz w:val="24"/>
-          <w:szCs w:val="24"/>
-        </w:rPr>
-      </w:pPr>
-      <w:r>
-        <w:rPr>
-          <w:rFonts w:ascii="Arial" w:hAnsi="Arial" w:cs="Arial"/>
-          <w:sz w:val="24"/>
-          <w:szCs w:val="24"/>
-        </w:rPr>
-        <w:tab/>
-      </w:r>
-    </w:p>
-    <w:p>
-      <w:pPr>
-        <w:spacing w:after="0" w:line="276" w:lineRule="auto"/>
-        <w:rPr>
-          <w:rFonts w:ascii="Arial" w:hAnsi="Arial" w:cs="Arial"/>
-          <w:sz w:val="24"/>
-          <w:szCs w:val="24"/>
-        </w:rPr>
-      </w:pPr>
-      <w:r>
-        <w:rPr>
-          <w:rFonts w:ascii="Arial" w:hAnsi="Arial" w:cs="Arial"/>
-          <w:b/>
-          <w:bCs/>
-          <w:sz w:val="24"/>
-          <w:szCs w:val="24"/>
-        </w:rPr>
-        <w:t xml:space="preserve">Local da obra: </w:t>
-      </w:r>
-      <w:r>
-        <w:rPr>
-          <w:rFonts w:ascii="Arial" w:hAnsi="Arial" w:cs="Arial"/>
-          <w:sz w:val="24"/>
-          <w:szCs w:val="24"/>
-        </w:rPr>
-        <w:t>{{</w:t>
-      </w:r>
-      <w:proofErr w:type="spellStart"/>
-      <w:r>
-        <w:rPr>
-          <w:rFonts w:ascii="Arial" w:hAnsi="Arial" w:cs="Arial"/>
-          <w:sz w:val="24"/>
-          <w:szCs w:val="24"/>
-        </w:rPr>
-        <w:t>local_obra</w:t>
-      </w:r>
-      <w:proofErr w:type="spellEnd"/>
-      <w:r>
-        <w:rPr>
-          <w:rFonts w:ascii="Arial" w:hAnsi="Arial" w:cs="Arial"/>
-          <w:sz w:val="24"/>
-          <w:szCs w:val="24"/>
-        </w:rPr>
-        <w:t>}}</w:t>
-      </w:r>
-    </w:p>
-    <w:p>
-      <w:pPr>
-        <w:spacing w:after="0" w:line="276" w:lineRule="auto"/>
-        <w:rPr>
-          <w:rFonts w:ascii="Arial" w:hAnsi="Arial" w:cs="Arial"/>
-          <w:b/>
-          <w:bCs/>
-          <w:sz w:val="24"/>
-          <w:szCs w:val="24"/>
-        </w:rPr>
-      </w:pPr>
-    </w:p>
-    <w:p>
-      <w:pPr>
-        <w:spacing w:after="0" w:line="276" w:lineRule="auto"/>
-        <w:rPr>
-          <w:rFonts w:ascii="Arial" w:hAnsi="Arial" w:cs="Arial"/>
-          <w:b/>
-          <w:bCs/>
-          <w:sz w:val="24"/>
-          <w:szCs w:val="24"/>
-        </w:rPr>
-      </w:pPr>
-      <w:r>
-        <w:rPr>
-          <w:rFonts w:ascii="Arial" w:hAnsi="Arial" w:cs="Arial"/>
-          <w:b/>
-          <w:bCs/>
-          <w:sz w:val="24"/>
-          <w:szCs w:val="24"/>
-        </w:rPr>
-        <w:t xml:space="preserve">CNPJ: </w:t>
-      </w:r>
-      <w:r>
-        <w:rPr>
-          <w:rFonts w:ascii="Arial" w:hAnsi="Arial" w:cs="Arial"/>
-          <w:sz w:val="24"/>
-          <w:szCs w:val="24"/>
-        </w:rPr>
-        <w:t>{{</w:t>
-      </w:r>
-      <w:proofErr w:type="spellStart"/>
-      <w:r>
-        <w:rPr>
-          <w:rFonts w:ascii="Arial" w:hAnsi="Arial" w:cs="Arial"/>
-          <w:sz w:val="24"/>
-          <w:szCs w:val="24"/>
-        </w:rPr>
-        <w:t>cnpj_texto</w:t>
-      </w:r>
-      <w:proofErr w:type="spellEnd"/>
-      <w:r>
-        <w:rPr>
-          <w:rFonts w:ascii="Arial" w:hAnsi="Arial" w:cs="Arial"/>
-          <w:sz w:val="24"/>
-          <w:szCs w:val="24"/>
-        </w:rPr>
-        <w:t>}}</w:t>
-      </w:r>
-      <w:bookmarkEnd w:id="0"/>
-    </w:p>
+    <w:bookmarkEnd w:id="0"/>
     <w:p>
       <w:pPr>
         <w:spacing w:after="0" w:line="240" w:lineRule="auto"/>
@@ -1356,35 +1433,10 @@
           <w:type w:val="continuous"/>
           <w:pgSz w:w="11906" w:h="16838"/>
           <w:pgMar w:top="2977" w:right="566" w:bottom="1417" w:left="567" w:header="737" w:footer="132" w:gutter="0"/>
-          <w:cols w:num="2" w:space="720"/>
+          <w:cols w:space="720"/>
           <w:formProt w:val="0"/>
           <w:docGrid w:linePitch="299"/>
         </w:sectPr>
-      </w:pPr>
-    </w:p>
-    <w:p>
-      <w:pPr>
-        <w:spacing w:after="0" w:line="240" w:lineRule="auto"/>
-        <w:jc w:val="center"/>
-        <w:rPr>
-          <w:rFonts w:ascii="Arial" w:hAnsi="Arial" w:cs="Arial"/>
-          <w:b/>
-          <w:sz w:val="20"/>
-          <w:szCs w:val="20"/>
-        </w:rPr>
-      </w:pPr>
-    </w:p>
-    <w:p>
-      <w:pPr>
-        <w:spacing w:after="0" w:line="240" w:lineRule="auto"/>
-        <w:jc w:val="center"/>
-        <w:rPr>
-          <w:rFonts w:ascii="Arial" w:hAnsi="Arial" w:cs="Arial"/>
-          <w:b/>
-          <w:bCs/>
-          <w:sz w:val="26"/>
-          <w:szCs w:val="26"/>
-        </w:rPr>
       </w:pPr>
     </w:p>
     <w:p>
@@ -2575,7 +2627,6 @@
         <w:rPr>
           <w:noProof/>
         </w:rPr>
-        <w:lastRenderedPageBreak/>
         <mc:AlternateContent>
           <mc:Choice Requires="wps">
             <w:drawing>
@@ -3920,7 +3971,7 @@
           <w:ilvl w:val="1"/>
           <w:numId w:val="2"/>
         </w:numPr>
-        <w:spacing w:after="0" w:line="240" w:lineRule="auto"/>
+        <w:spacing w:after="0" w:line="360" w:lineRule="auto"/>
         <w:jc w:val="both"/>
       </w:pPr>
       <w:r>
@@ -3939,7 +3990,7 @@
           <w:ilvl w:val="1"/>
           <w:numId w:val="2"/>
         </w:numPr>
-        <w:spacing w:after="0" w:line="240" w:lineRule="auto"/>
+        <w:spacing w:after="0" w:line="360" w:lineRule="auto"/>
         <w:jc w:val="both"/>
       </w:pPr>
       <w:r>
@@ -3948,7 +3999,7 @@
     </w:p>
     <w:p>
       <w:pPr>
-        <w:spacing w:after="0" w:line="240" w:lineRule="auto"/>
+        <w:spacing w:after="0" w:line="360" w:lineRule="auto"/>
         <w:ind w:firstLine="708"/>
         <w:jc w:val="both"/>
         <w:rPr>
@@ -4813,6 +4864,7 @@
           <w:sz w:val="20"/>
           <w:szCs w:val="20"/>
         </w:rPr>
+        <w:lastRenderedPageBreak/>
         <w:t xml:space="preserve">- </w:t>
       </w:r>
       <w:r>
@@ -5380,7 +5432,7 @@
     </w:p>
     <w:p>
       <w:pPr>
-        <w:spacing w:after="0" w:line="240" w:lineRule="auto"/>
+        <w:spacing w:after="0" w:line="360" w:lineRule="auto"/>
         <w:ind w:firstLine="708"/>
         <w:jc w:val="both"/>
         <w:rPr>
@@ -5400,18 +5452,7 @@
     </w:p>
     <w:p>
       <w:pPr>
-        <w:spacing w:after="0" w:line="240" w:lineRule="auto"/>
-        <w:rPr>
-          <w:rFonts w:ascii="Arial" w:hAnsi="Arial" w:cs="Arial"/>
-          <w:b/>
-          <w:sz w:val="20"/>
-          <w:szCs w:val="20"/>
-        </w:rPr>
-      </w:pPr>
-    </w:p>
-    <w:p>
-      <w:pPr>
-        <w:spacing w:after="0" w:line="240" w:lineRule="auto"/>
+        <w:spacing w:after="0" w:line="360" w:lineRule="auto"/>
         <w:rPr>
           <w:rFonts w:ascii="Arial" w:hAnsi="Arial" w:cs="Arial"/>
           <w:b/>
@@ -5458,9 +5499,9 @@
       </w:tblPr>
       <w:tblGrid>
         <w:gridCol w:w="605"/>
-        <w:gridCol w:w="6691"/>
-        <w:gridCol w:w="1239"/>
-        <w:gridCol w:w="538"/>
+        <w:gridCol w:w="6053"/>
+        <w:gridCol w:w="1559"/>
+        <w:gridCol w:w="856"/>
         <w:gridCol w:w="1701"/>
       </w:tblGrid>
       <w:tr>
@@ -5491,7 +5532,7 @@
         </w:tc>
         <w:tc>
           <w:tcPr>
-            <w:tcW w:w="6691" w:type="dxa"/>
+            <w:tcW w:w="6053" w:type="dxa"/>
             <w:shd w:val="clear" w:color="auto" w:fill="1F3864" w:themeFill="accent5" w:themeFillShade="80"/>
           </w:tcPr>
           <w:p>
@@ -5516,7 +5557,7 @@
         </w:tc>
         <w:tc>
           <w:tcPr>
-            <w:tcW w:w="1239" w:type="dxa"/>
+            <w:tcW w:w="1559" w:type="dxa"/>
             <w:shd w:val="clear" w:color="auto" w:fill="1F3864" w:themeFill="accent5" w:themeFillShade="80"/>
           </w:tcPr>
           <w:p>
@@ -5541,7 +5582,7 @@
         </w:tc>
         <w:tc>
           <w:tcPr>
-            <w:tcW w:w="538" w:type="dxa"/>
+            <w:tcW w:w="856" w:type="dxa"/>
             <w:shd w:val="clear" w:color="auto" w:fill="1F3864" w:themeFill="accent5" w:themeFillShade="80"/>
           </w:tcPr>
           <w:p>
@@ -5617,7 +5658,7 @@
         </w:tc>
         <w:tc>
           <w:tcPr>
-            <w:tcW w:w="6691" w:type="dxa"/>
+            <w:tcW w:w="6053" w:type="dxa"/>
           </w:tcPr>
           <w:p>
             <w:pPr>
@@ -5641,7 +5682,7 @@
         </w:tc>
         <w:tc>
           <w:tcPr>
-            <w:tcW w:w="1239" w:type="dxa"/>
+            <w:tcW w:w="1559" w:type="dxa"/>
           </w:tcPr>
           <w:p>
             <w:pPr>
@@ -5665,7 +5706,7 @@
         </w:tc>
         <w:tc>
           <w:tcPr>
-            <w:tcW w:w="538" w:type="dxa"/>
+            <w:tcW w:w="856" w:type="dxa"/>
           </w:tcPr>
           <w:p>
             <w:pPr>
@@ -5683,16 +5724,7 @@
                 <w:sz w:val="20"/>
                 <w:szCs w:val="20"/>
               </w:rPr>
-              <w:t>{{quantidade</w:t>
-            </w:r>
-            <w:r>
-              <w:rPr>
-                <w:rFonts w:ascii="Arial" w:eastAsia="Arial" w:hAnsi="Arial"/>
-                <w:sz w:val="20"/>
-                <w:szCs w:val="20"/>
-              </w:rPr>
-              <w:lastRenderedPageBreak/>
-              <w:t>_a}}</w:t>
+              <w:t>{{quantidade_a}}</w:t>
             </w:r>
           </w:p>
         </w:tc>
@@ -5716,7 +5748,6 @@
                 <w:sz w:val="20"/>
                 <w:szCs w:val="20"/>
               </w:rPr>
-              <w:lastRenderedPageBreak/>
               <w:t>{{valor_a}}</w:t>
             </w:r>
           </w:p>
@@ -5979,6 +6010,7 @@
         <w:t>adto</w:t>
       </w:r>
       <w:proofErr w:type="spellEnd"/>
+      <w:proofErr w:type="gramStart"/>
       <w:r>
         <w:rPr>
           <w:rFonts w:ascii="Arial" w:eastAsia="Arial" w:hAnsi="Arial"/>
@@ -5989,6 +6021,7 @@
         </w:rPr>
         <w:t>}}%</w:t>
       </w:r>
+      <w:proofErr w:type="gramEnd"/>
       <w:r>
         <w:rPr>
           <w:rFonts w:ascii="Arial" w:eastAsia="Arial" w:hAnsi="Arial"/>
@@ -6327,7 +6360,7 @@
           <w:sz w:val="20"/>
           <w:szCs w:val="20"/>
         </w:rPr>
-        <w:t>R${{</w:t>
+        <w:t>{{</w:t>
       </w:r>
       <w:proofErr w:type="spellStart"/>
       <w:r>
@@ -6646,7 +6679,6 @@
                 <w:sz w:val="20"/>
                 <w:szCs w:val="20"/>
               </w:rPr>
-              <w:lastRenderedPageBreak/>
               <w:t xml:space="preserve">Mobilização Extra (por evento ida e volta) </w:t>
             </w:r>
           </w:p>
@@ -6671,7 +6703,16 @@
                 <w:sz w:val="20"/>
                 <w:szCs w:val="20"/>
               </w:rPr>
-              <w:t xml:space="preserve">R$  </w:t>
+              <w:t>R</w:t>
+            </w:r>
+            <w:proofErr w:type="gramStart"/>
+            <w:r>
+              <w:rPr>
+                <w:rFonts w:ascii="Arial" w:eastAsia="Arial" w:hAnsi="Arial"/>
+                <w:sz w:val="20"/>
+                <w:szCs w:val="20"/>
+              </w:rPr>
+              <w:t xml:space="preserve">$  </w:t>
             </w:r>
             <w:r>
               <w:rPr>
@@ -6680,7 +6721,17 @@
                 <w:szCs w:val="20"/>
                 <w:lang w:val="en-US"/>
               </w:rPr>
-              <w:t>{{</w:t>
+              <w:t>{</w:t>
+            </w:r>
+            <w:proofErr w:type="gramEnd"/>
+            <w:r>
+              <w:rPr>
+                <w:rFonts w:ascii="Arial" w:eastAsia="Arial" w:hAnsi="Arial"/>
+                <w:sz w:val="20"/>
+                <w:szCs w:val="20"/>
+                <w:lang w:val="en-US"/>
+              </w:rPr>
+              <w:t>{</w:t>
             </w:r>
             <w:proofErr w:type="spellStart"/>
             <w:r>
@@ -6722,6 +6773,7 @@
           <w:b/>
           <w:bCs/>
         </w:rPr>
+        <w:lastRenderedPageBreak/>
         <w:t>Stand-by de Equipe</w:t>
       </w:r>
       <w:r>
@@ -7094,7 +7146,16 @@
           <w:sz w:val="20"/>
           <w:szCs w:val="20"/>
         </w:rPr>
-        <w:t>A Contratante reconhece que os serviços contratados são parte de um pacote integral, cujo valor foi estipulado considerando sua totalidade. Dessa forma, a eventual desistência, cancelamento ou não utilização de qualquer serviço incluído no pacote não dará direito à Contratante a reembolso, abatimento ou desconto proporcional sobre o valor total contratado, permanecendo a obrigação de pagamento integral nos termos acordados.</w:t>
+        <w:t xml:space="preserve">A Contratante reconhece que os serviços contratados são parte de um pacote integral, cujo valor foi estipulado considerando sua totalidade. Dessa forma, a eventual desistência, cancelamento ou não utilização de qualquer </w:t>
+      </w:r>
+      <w:r>
+        <w:rPr>
+          <w:rFonts w:ascii="Arial" w:hAnsi="Arial" w:cs="Arial"/>
+          <w:sz w:val="20"/>
+          <w:szCs w:val="20"/>
+        </w:rPr>
+        <w:lastRenderedPageBreak/>
+        <w:t>serviço incluído no pacote não dará direito à Contratante a reembolso, abatimento ou desconto proporcional sobre o valor total contratado, permanecendo a obrigação de pagamento integral nos termos acordados.</w:t>
       </w:r>
     </w:p>
     <w:p>
@@ -7887,14 +7948,25 @@
           <w:szCs w:val="20"/>
         </w:rPr>
       </w:pPr>
-      <w:r>
-        <w:rPr>
-          <w:rFonts w:ascii="Arial" w:hAnsi="Arial" w:cs="Arial"/>
-          <w:bCs/>
-          <w:sz w:val="20"/>
-          <w:szCs w:val="20"/>
-        </w:rPr>
-        <w:t>[    ] Declaro ter lido, compreendido e aceitado integralmente os termos e condições apresentados na presente proposta.</w:t>
+      <w:proofErr w:type="gramStart"/>
+      <w:r>
+        <w:rPr>
+          <w:rFonts w:ascii="Arial" w:hAnsi="Arial" w:cs="Arial"/>
+          <w:bCs/>
+          <w:sz w:val="20"/>
+          <w:szCs w:val="20"/>
+        </w:rPr>
+        <w:t>[    ]</w:t>
+      </w:r>
+      <w:proofErr w:type="gramEnd"/>
+      <w:r>
+        <w:rPr>
+          <w:rFonts w:ascii="Arial" w:hAnsi="Arial" w:cs="Arial"/>
+          <w:bCs/>
+          <w:sz w:val="20"/>
+          <w:szCs w:val="20"/>
+        </w:rPr>
+        <w:t xml:space="preserve"> Declaro ter lido, compreendido e aceitado integralmente os termos e condições apresentados na presente proposta.</w:t>
       </w:r>
     </w:p>
     <w:p>
@@ -9939,7 +10011,7 @@
   <w:style w:type="paragraph" w:default="1" w:styleId="Normal">
     <w:name w:val="Normal"/>
     <w:qFormat/>
-    <w:rsid w:val="00A218CB"/>
+    <w:rsid w:val="00656E0A"/>
     <w:pPr>
       <w:spacing w:after="160" w:line="259" w:lineRule="auto"/>
     </w:pPr>
@@ -10340,6 +10412,15 @@
 </file>
 
 <file path=customXml/item1.xml><?xml version="1.0" encoding="utf-8"?>
+<?mso-contentType ?>
+<FormTemplates xmlns="http://schemas.microsoft.com/sharepoint/v3/contenttype/forms">
+  <Display>DocumentLibraryForm</Display>
+  <Edit>DocumentLibraryForm</Edit>
+  <New>DocumentLibraryForm</New>
+</FormTemplates>
+</file>
+
+<file path=customXml/item2.xml><?xml version="1.0" encoding="utf-8"?>
 <p:properties xmlns:p="http://schemas.microsoft.com/office/2006/metadata/properties" xmlns:xsi="http://www.w3.org/2001/XMLSchema-instance" xmlns:pc="http://schemas.microsoft.com/office/infopath/2007/PartnerControls">
   <documentManagement>
     <lcf76f155ced4ddcb4097134ff3c332f xmlns="5ebac46c-3801-4f50-8d40-ff19a3d08a31">
@@ -10351,16 +10432,11 @@
 </p:properties>
 </file>
 
-<file path=customXml/item2.xml><?xml version="1.0" encoding="utf-8"?>
-<?mso-contentType ?>
-<FormTemplates xmlns="http://schemas.microsoft.com/sharepoint/v3/contenttype/forms">
-  <Display>DocumentLibraryForm</Display>
-  <Edit>DocumentLibraryForm</Edit>
-  <New>DocumentLibraryForm</New>
-</FormTemplates>
+<file path=customXml/item3.xml><?xml version="1.0" encoding="utf-8"?>
+<b:Sources xmlns:b="http://schemas.openxmlformats.org/officeDocument/2006/bibliography" xmlns="http://schemas.openxmlformats.org/officeDocument/2006/bibliography" SelectedStyle="\APASixthEditionOfficeOnline.xsl" StyleName="APA" Version="6"/>
 </file>
 
-<file path=customXml/item3.xml><?xml version="1.0" encoding="utf-8"?>
+<file path=customXml/item4.xml><?xml version="1.0" encoding="utf-8"?>
 <ct:contentTypeSchema xmlns:ct="http://schemas.microsoft.com/office/2006/metadata/contentType" xmlns:ma="http://schemas.microsoft.com/office/2006/metadata/properties/metaAttributes" ct:_="" ma:_="" ma:contentTypeName="Documento" ma:contentTypeID="0x01010050D375E88928F94091E6FD7AA4E06D15" ma:contentTypeVersion="13" ma:contentTypeDescription="Crie um novo documento." ma:contentTypeScope="" ma:versionID="7df79d7f540b57f8739ecf349a4839bc">
   <xsd:schema xmlns:xsd="http://www.w3.org/2001/XMLSchema" xmlns:xs="http://www.w3.org/2001/XMLSchema" xmlns:p="http://schemas.microsoft.com/office/2006/metadata/properties" xmlns:ns2="5ebac46c-3801-4f50-8d40-ff19a3d08a31" xmlns:ns3="04f7cffc-3ea8-4655-aac6-2c812ca3e62f" targetNamespace="http://schemas.microsoft.com/office/2006/metadata/properties" ma:root="true" ma:fieldsID="096b32e32a0a7c12d0d47f4c83d7cab2" ns2:_="" ns3:_="">
     <xsd:import namespace="5ebac46c-3801-4f50-8d40-ff19a3d08a31"/>
@@ -10569,11 +10645,15 @@
 </ct:contentTypeSchema>
 </file>
 
-<file path=customXml/item4.xml><?xml version="1.0" encoding="utf-8"?>
-<b:Sources xmlns:b="http://schemas.openxmlformats.org/officeDocument/2006/bibliography" xmlns="http://schemas.openxmlformats.org/officeDocument/2006/bibliography" SelectedStyle="\APASixthEditionOfficeOnline.xsl" StyleName="APA" Version="6"/>
+<file path=customXml/itemProps1.xml><?xml version="1.0" encoding="utf-8"?>
+<ds:datastoreItem xmlns:ds="http://schemas.openxmlformats.org/officeDocument/2006/customXml" ds:itemID="{34A391BE-20F1-46BC-8252-C95237E583C0}">
+  <ds:schemaRefs>
+    <ds:schemaRef ds:uri="http://schemas.microsoft.com/sharepoint/v3/contenttype/forms"/>
+  </ds:schemaRefs>
+</ds:datastoreItem>
 </file>
 
-<file path=customXml/itemProps1.xml><?xml version="1.0" encoding="utf-8"?>
+<file path=customXml/itemProps2.xml><?xml version="1.0" encoding="utf-8"?>
 <ds:datastoreItem xmlns:ds="http://schemas.openxmlformats.org/officeDocument/2006/customXml" ds:itemID="{FA899CDF-3A9C-426B-93AD-3CCFF23C4A5E}">
   <ds:schemaRefs>
     <ds:schemaRef ds:uri="http://schemas.microsoft.com/office/2006/metadata/properties"/>
@@ -10584,15 +10664,15 @@
 </ds:datastoreItem>
 </file>
 
-<file path=customXml/itemProps2.xml><?xml version="1.0" encoding="utf-8"?>
-<ds:datastoreItem xmlns:ds="http://schemas.openxmlformats.org/officeDocument/2006/customXml" ds:itemID="{34A391BE-20F1-46BC-8252-C95237E583C0}">
+<file path=customXml/itemProps3.xml><?xml version="1.0" encoding="utf-8"?>
+<ds:datastoreItem xmlns:ds="http://schemas.openxmlformats.org/officeDocument/2006/customXml" ds:itemID="{AB0B6225-2C28-4B59-AC07-D3905D9EBCC2}">
   <ds:schemaRefs>
-    <ds:schemaRef ds:uri="http://schemas.microsoft.com/sharepoint/v3/contenttype/forms"/>
+    <ds:schemaRef ds:uri="http://schemas.openxmlformats.org/officeDocument/2006/bibliography"/>
   </ds:schemaRefs>
 </ds:datastoreItem>
 </file>
 
-<file path=customXml/itemProps3.xml><?xml version="1.0" encoding="utf-8"?>
+<file path=customXml/itemProps4.xml><?xml version="1.0" encoding="utf-8"?>
 <ds:datastoreItem xmlns:ds="http://schemas.openxmlformats.org/officeDocument/2006/customXml" ds:itemID="{71D38CE4-905C-4C05-8C70-49A1BD3E3A17}">
   <ds:schemaRefs>
     <ds:schemaRef ds:uri="http://schemas.microsoft.com/office/2006/metadata/contentType"/>
@@ -10609,12 +10689,4 @@
     <ds:schemaRef ds:uri="http://schemas.microsoft.com/internal/obd"/>
   </ds:schemaRefs>
 </ds:datastoreItem>
-</file>
-
-<file path=customXml/itemProps4.xml><?xml version="1.0" encoding="utf-8"?>
-<ds:datastoreItem xmlns:ds="http://schemas.openxmlformats.org/officeDocument/2006/customXml" ds:itemID="{AB0B6225-2C28-4B59-AC07-D3905D9EBCC2}">
-  <ds:schemaRefs>
-    <ds:schemaRef ds:uri="http://schemas.openxmlformats.org/officeDocument/2006/bibliography"/>
-  </ds:schemaRefs>
-</ds:datastoreItem>
 </file>
</xml_diff>